<commit_message>
Add Zenodo DOI and citation metadata across documentation
Additive metadata only: no code, tests, numbers, figures, claims, or the verified
§11 reference list were changed.

  - README.md: new "## Citation" section (permanent Zenodo DOI, canonical citation
    string, note that the report is CC BY 4.0 and the code MIT).
  - docs/REPORT.md: DOI + "Archived on Zenodo (open access, CC BY 4.0)" in the
    front matter; regenerated docs/report/nous_report.tex (\date block) and
    nous_report.docx so all three carry the DOI in the same place.
  - docs/outreach/SUMMARY.md: DOI footer line; SUMMARY.docx regenerated.
  - docs/outreach/EMAILS.md: link placeholders in templates A, B, C replaced with
    the DOI (name/email/institution placeholders left intact).
  - CITATION.cff: new at repo root (CFF 1.2.0; DOI 10.5281/zenodo.20474613;
    license CC-BY-4.0) so GitHub shows a "Cite this repository" button.

DOI: https://doi.org/10.5281/zenodo.20474613
</commit_message>
<xml_diff>
--- a/docs/outreach/SUMMARY.docx
+++ b/docs/outreach/SUMMARY.docx
@@ -246,6 +246,11 @@
       </w:r>
       <w:r>
         <w:t xml:space="preserve"> this part is proven; that part is not, and here is the failing test that says so.</w:t>
+      </w:r>
+    </w:p>
+    <w:p>
+      <w:r>
+        <w:t>Report (open access, CC BY 4.0): https://doi.org/10.5281/zenodo.20474613</w:t>
       </w:r>
     </w:p>
     <w:sectPr>

</xml_diff>

<commit_message>
chore: rename the project Nous -> Psyche everywhere (D-030)
One name for paper, code and repository. Modules become src/psyche_*.py and
suites tests/test_psyche_*.py; docs, tools, the ledger, the social cards
(Greek mark now ψυχή), the slides, SUMMARY.docx and the two diagrams whose
labels named the old modules follow.

Kept on purpose, because each is a record that must not be edited after the
fact: docs/report/ (the DOI-published source, D-012), the archived Zenodo
title where it is cited with the DOI, docs/experiments/ (frozen
pre-registrations), experiments/results/ (captured logs and hash-pinned data,
which contain the SWOW word "nous"), and test paths that read old commits.

Per-suite assertion counts match the pre-rename baseline, and the
git-recovered oracles run again after a word-level diff caught them silently
degrading on the first pass.
</commit_message>
<xml_diff>
--- a/docs/outreach/SUMMARY.docx
+++ b/docs/outreach/SUMMARY.docx
@@ -12,7 +12,7 @@
           <w:color w:val="1A1A1A"/>
           <w:sz w:val="34"/>
         </w:rPr>
-        <w:t>Nous: a one-page summary</w:t>
+        <w:t>Psyche: a one-page summary</w:t>
       </w:r>
     </w:p>
     <w:p>
@@ -23,7 +23,7 @@
         <w:t>What it is:</w:t>
       </w:r>
       <w:r>
-        <w:t xml:space="preserve"> Nous is a dependency-free Python prototype of a memory-and-activation substrate for a cognitive architecture, presented as much as a software-testing-methodology case study as an engineering artifact: a small system built test-first, in which adversarial testing caught a sequence of real structural bugs. It is not a mind, a consciousness, an AGI, or a validated cognitive model; the neuroscience it borrows vocabulary from is conceptual inspiration only.</w:t>
+        <w:t xml:space="preserve"> Psyche is a dependency-free Python prototype of a memory-and-activation substrate for a cognitive architecture, presented as much as a software-testing-methodology case study as an engineering artifact: a small system built test-first, in which adversarial testing caught a sequence of real structural bugs. It is not a mind, a consciousness, an AGI, or a validated cognitive model; the neuroscience it borrows vocabulary from is conceptual inspiration only.</w:t>
       </w:r>
     </w:p>
     <w:p>
@@ -225,7 +225,7 @@
         <w:t>measurable</w:t>
       </w:r>
       <w:r>
-        <w:t xml:space="preserve"> cognitive effect whose direction is known independently of Nous, for example </w:t>
+        <w:t xml:space="preserve"> cognitive effect whose direction is known independently of Psyche, for example </w:t>
       </w:r>
       <w:r>
         <w:rPr>

</xml_diff>